<commit_message>
Remove Kubernetes from first-year service-control scope
</commit_message>
<xml_diff>
--- a/docs/deliverables/docx/02_Agent_Registration_Management_Prototype.docx
+++ b/docs/deliverables/docx/02_Agent_Registration_Management_Prototype.docx
@@ -53,7 +53,7 @@
       <w:r>
         <w:drawing>
           <wp:inline>
-            <wp:extent cx="5334000" cy="1693333"/>
+            <wp:extent cx="5334000" cy="2733675"/>
             <wp:effectExtent b="0" l="0" r="0" t="0"/>
             <wp:docPr descr="에이전트 등록 관리 흐름도" title="" id="11" name="Picture"/>
             <a:graphic>
@@ -74,7 +74,7 @@
                   <pic:spPr bwMode="auto">
                     <a:xfrm>
                       <a:off x="0" y="0"/>
-                      <a:ext cx="5334000" cy="1693333"/>
+                      <a:ext cx="5334000" cy="2733675"/>
                     </a:xfrm>
                     <a:prstGeom prst="rect">
                       <a:avLst/>
@@ -660,7 +660,7 @@
               <w:rPr>
                 <w:rStyle w:val="VerbatimChar"/>
               </w:rPr>
-              <w:t xml:space="preserve">app_scale_deployment</w:t>
+              <w:t xml:space="preserve">app_scale_service_instances</w:t>
             </w:r>
           </w:p>
         </w:tc>
@@ -1180,7 +1180,7 @@
         <w:rPr>
           <w:rStyle w:val="VerbatimChar"/>
         </w:rPr>
-        <w:t xml:space="preserve">  --action app_scale_deployment</w:t>
+        <w:t xml:space="preserve">  --action app_scale_service_instances</w:t>
       </w:r>
     </w:p>
     <w:p>

</xml_diff>